<commit_message>
Update documentation files to reflect recent project changes
Update numerous generated documentation files in .docx and .pdf formats.

Replit-Commit-Author: Agent
Replit-Commit-Session-Id: c47afaae-4799-46fb-ad38-da4770bdf36e
Replit-Commit-Checkpoint-Type: full_checkpoint
Replit-Commit-Event-Id: 23def848-dd46-42f1-8eb1-73bbbde544c7
Replit-Commit-Screenshot-Url: https://storage.googleapis.com/screenshot-production-us-central1/efc895ca-161b-43cb-8555-2a7825ee93b6/c47afaae-4799-46fb-ad38-da4770bdf36e/gWFwQ9i
Replit-Helium-Checkpoint-Created: true
</commit_message>
<xml_diff>
--- a/generated_docs/0b0c4df9-15fc-4432-bb65-356e1e4bc108.docx
+++ b/generated_docs/0b0c4df9-15fc-4432-bb65-356e1e4bc108.docx
@@ -2351,6 +2351,126 @@
     </w:p>
     <w:p>
       <w:pPr>
+        <w:spacing w:before="400"/>
+      </w:pPr>
+    </w:p>
+    <w:p>
+      <w:pPr>
+        <w:pBdr>
+          <w:bottom w:val="single" w:color="333333" w:sz="2"/>
+        </w:pBdr>
+        <w:spacing w:after="200"/>
+        <w:jc w:val="center"/>
+      </w:pPr>
+      <w:r>
+        <w:rPr>
+          <w:rFonts w:ascii="Calibri" w:cs="Calibri" w:eastAsia="Calibri" w:hAnsi="Calibri"/>
+          <w:b/>
+          <w:bCs/>
+          <w:sz w:val="22"/>
+          <w:szCs w:val="22"/>
+        </w:rPr>
+        <w:t xml:space="preserve">DIGITAL SIGNATURE</w:t>
+      </w:r>
+    </w:p>
+    <w:p>
+      <w:pPr>
+        <w:spacing w:after="100"/>
+      </w:pPr>
+      <w:r>
+        <w:rPr>
+          <w:rFonts w:ascii="Calibri" w:cs="Calibri" w:eastAsia="Calibri" w:hAnsi="Calibri"/>
+          <w:b/>
+          <w:bCs/>
+          <w:sz w:val="18"/>
+          <w:szCs w:val="18"/>
+        </w:rPr>
+        <w:t xml:space="preserve">FOR &amp; ON BEHALF OF BUYER / ISSUER</w:t>
+      </w:r>
+    </w:p>
+    <w:p>
+      <w:pPr>
+        <w:spacing w:after="60"/>
+      </w:pPr>
+      <w:r>
+        <w:drawing>
+          <wp:inline distT="0" distB="0" distL="0" distR="0">
+            <wp:extent cx="1714500" cy="666750"/>
+            <wp:effectExtent t="0" r="0" b="0" l="0"/>
+            <wp:docPr id="1" name="" descr="" title=""/>
+            <wp:cNvGraphicFramePr>
+              <a:graphicFrameLocks xmlns:a="http://schemas.openxmlformats.org/drawingml/2006/main" noChangeAspect="1"/>
+            </wp:cNvGraphicFramePr>
+            <a:graphic xmlns:a="http://schemas.openxmlformats.org/drawingml/2006/main">
+              <a:graphicData uri="http://schemas.openxmlformats.org/drawingml/2006/picture">
+                <pic:pic xmlns:pic="http://schemas.openxmlformats.org/drawingml/2006/picture">
+                  <pic:nvPicPr>
+                    <pic:cNvPr id="0" name="" descr=""/>
+                    <pic:cNvPicPr>
+                      <a:picLocks noChangeAspect="1" noChangeArrowheads="1"/>
+                    </pic:cNvPicPr>
+                  </pic:nvPicPr>
+                  <pic:blipFill>
+                    <a:blip r:embed="rId7" cstate="none"/>
+                    <a:srcRect/>
+                    <a:stretch>
+                      <a:fillRect/>
+                    </a:stretch>
+                  </pic:blipFill>
+                  <pic:spPr bwMode="auto">
+                    <a:xfrm>
+                      <a:off x="0" y="0"/>
+                      <a:ext cx="1714500" cy="666750"/>
+                    </a:xfrm>
+                    <a:prstGeom prst="rect">
+                      <a:avLst/>
+                    </a:prstGeom>
+                  </pic:spPr>
+                </pic:pic>
+              </a:graphicData>
+            </a:graphic>
+          </wp:inline>
+        </w:drawing>
+      </w:r>
+    </w:p>
+    <w:p>
+      <w:pPr>
+        <w:spacing w:after="40"/>
+      </w:pPr>
+      <w:r>
+        <w:rPr>
+          <w:rFonts w:ascii="Calibri" w:cs="Calibri" w:eastAsia="Calibri" w:hAnsi="Calibri"/>
+          <w:sz w:val="18"/>
+          <w:szCs w:val="18"/>
+        </w:rPr>
+        <w:t xml:space="preserve">Name: vk</w:t>
+      </w:r>
+    </w:p>
+    <w:p>
+      <w:pPr>
+        <w:spacing w:after="40"/>
+      </w:pPr>
+      <w:r>
+        <w:rPr>
+          <w:rFonts w:ascii="Calibri" w:cs="Calibri" w:eastAsia="Calibri" w:hAnsi="Calibri"/>
+          <w:sz w:val="18"/>
+          <w:szCs w:val="18"/>
+        </w:rPr>
+        <w:t xml:space="preserve">Signed: 02 Jun 2026 10:17:36 UTC</w:t>
+      </w:r>
+    </w:p>
+    <w:p>
+      <w:r>
+        <w:rPr>
+          <w:rFonts w:ascii="Calibri" w:cs="Calibri" w:eastAsia="Calibri" w:hAnsi="Calibri"/>
+          <w:sz w:val="18"/>
+          <w:szCs w:val="18"/>
+        </w:rPr>
+        <w:t xml:space="preserve">IP: 83.110.104.61</w:t>
+      </w:r>
+    </w:p>
+    <w:p>
+      <w:pPr>
         <w:spacing w:before="600"/>
       </w:pPr>
     </w:p>
@@ -2401,23 +2521,6 @@
           <w:szCs w:val="16"/>
         </w:rPr>
         <w:t xml:space="preserve">Issued by Bullex Trading Platform</w:t>
-      </w:r>
-    </w:p>
-    <w:p>
-      <w:pPr>
-        <w:spacing w:after="40"/>
-        <w:jc w:val="center"/>
-      </w:pPr>
-      <w:r>
-        <w:rPr>
-          <w:rFonts w:ascii="Calibri" w:cs="Calibri" w:eastAsia="Calibri" w:hAnsi="Calibri"/>
-          <w:i/>
-          <w:iCs/>
-          <w:color w:val="666666"/>
-          <w:sz w:val="14"/>
-          <w:szCs w:val="14"/>
-        </w:rPr>
-        <w:t xml:space="preserve">Generated by: Bullex Admin</w:t>
       </w:r>
     </w:p>
     <w:sectPr>

</xml_diff>